<commit_message>
Add engineering scaffold, services, portals, and v2.0 docx refresh
Commit the full working tree: the Charter-derived engineering scaffold
(src/, deploy/, 00-07 SDLC docs, root governance/build files), the
Candidates and Recruitment vertical slices, the Business BFF, the five
localised portals and the @illumin360/ui design-system package, plus the
regenerated v2.0 .docx set and the populator.py _rels-restore fix.

Note: web/ remains gitignored (React proof-slice + node_modules).

Co-Authored-By: Claude Opus 5 <noreply@anthropic.com>
</commit_message>
<xml_diff>
--- a/_v2.0_refresh/_populated_v2_0/03_System_Design/Detailed_Design/API_Design/ILLM-03-005_API_Design_v2_0.docx
+++ b/_v2.0_refresh/_populated_v2_0/03_System_Design/Detailed_Design/API_Design/ILLM-03-005_API_Design_v2_0.docx
@@ -1632,6 +1632,160 @@
           </w:p>
         </w:tc>
       </w:tr>
+      <w:tr>
+        <w:tc>
+          <w:tcPr>
+            <w:tcW w:type="dxa" w:w="1200"/>
+            <w:gridSpan w:val="1"/>
+            <w:tcBorders>
+              <w:top w:val="single" w:color="DDDDDD" w:sz="4"/>
+              <w:left w:val="single" w:color="DDDDDD" w:sz="4"/>
+              <w:bottom w:val="single" w:color="DDDDDD" w:sz="4"/>
+              <w:right w:val="single" w:color="DDDDDD" w:sz="4"/>
+            </w:tcBorders>
+            <w:shd w:fill="FFFFFF" w:val="clear"/>
+            <w:tcMar>
+              <w:top w:type="dxa" w:w="80"/>
+              <w:left w:type="dxa" w:w="120"/>
+              <w:bottom w:type="dxa" w:w="80"/>
+              <w:right w:type="dxa" w:w="120"/>
+            </w:tcMar>
+            <w:vAlign w:val="center"/>
+          </w:tcPr>
+          <w:p>
+            <w:pPr>
+              <w:jc w:val="left"/>
+            </w:pPr>
+            <w:r>
+              <w:rPr>
+                <w:rFonts w:ascii="Arial" w:cs="Arial" w:eastAsia="Arial" w:hAnsi="Arial"/>
+                <w:b w:val="false"/>
+                <w:bCs w:val="false"/>
+                <w:i w:val="false"/>
+                <w:iCs w:val="false"/>
+                <w:color w:val="1A1A1A"/>
+                <w:sz w:val="18"/>
+                <w:szCs w:val="18"/>
+              </w:rPr>
+              <w:t xml:space="preserve">2.1</w:t>
+            </w:r>
+          </w:p>
+        </w:tc>
+        <w:tc>
+          <w:tcPr>
+            <w:tcW w:type="dxa" w:w="2600"/>
+            <w:gridSpan w:val="1"/>
+            <w:tcBorders>
+              <w:top w:val="single" w:color="DDDDDD" w:sz="4"/>
+              <w:left w:val="single" w:color="DDDDDD" w:sz="4"/>
+              <w:bottom w:val="single" w:color="DDDDDD" w:sz="4"/>
+              <w:right w:val="single" w:color="DDDDDD" w:sz="4"/>
+            </w:tcBorders>
+            <w:shd w:fill="FFFFFF" w:val="clear"/>
+            <w:tcMar>
+              <w:top w:type="dxa" w:w="80"/>
+              <w:left w:type="dxa" w:w="120"/>
+              <w:bottom w:type="dxa" w:w="80"/>
+              <w:right w:type="dxa" w:w="120"/>
+            </w:tcMar>
+            <w:vAlign w:val="center"/>
+          </w:tcPr>
+          <w:p>
+            <w:pPr>
+              <w:jc w:val="left"/>
+            </w:pPr>
+            <w:r>
+              <w:rPr>
+                <w:rFonts w:ascii="Arial" w:cs="Arial" w:eastAsia="Arial" w:hAnsi="Arial"/>
+                <w:b w:val="false"/>
+                <w:bCs w:val="false"/>
+                <w:i w:val="false"/>
+                <w:iCs w:val="false"/>
+                <w:color w:val="1A1A1A"/>
+                <w:sz w:val="18"/>
+                <w:szCs w:val="18"/>
+              </w:rPr>
+              <w:t xml:space="preserve">30 May 2026</w:t>
+            </w:r>
+          </w:p>
+        </w:tc>
+        <w:tc>
+          <w:tcPr>
+            <w:tcW w:type="dxa" w:w="2600"/>
+            <w:gridSpan w:val="1"/>
+            <w:tcBorders>
+              <w:top w:val="single" w:color="DDDDDD" w:sz="4"/>
+              <w:left w:val="single" w:color="DDDDDD" w:sz="4"/>
+              <w:bottom w:val="single" w:color="DDDDDD" w:sz="4"/>
+              <w:right w:val="single" w:color="DDDDDD" w:sz="4"/>
+            </w:tcBorders>
+            <w:shd w:fill="FFFFFF" w:val="clear"/>
+            <w:tcMar>
+              <w:top w:type="dxa" w:w="80"/>
+              <w:left w:type="dxa" w:w="120"/>
+              <w:bottom w:type="dxa" w:w="80"/>
+              <w:right w:type="dxa" w:w="120"/>
+            </w:tcMar>
+            <w:vAlign w:val="center"/>
+          </w:tcPr>
+          <w:p>
+            <w:pPr>
+              <w:jc w:val="left"/>
+            </w:pPr>
+            <w:r>
+              <w:rPr>
+                <w:rFonts w:ascii="Arial" w:cs="Arial" w:eastAsia="Arial" w:hAnsi="Arial"/>
+                <w:b w:val="false"/>
+                <w:bCs w:val="false"/>
+                <w:i w:val="false"/>
+                <w:iCs w:val="false"/>
+                <w:color w:val="1A1A1A"/>
+                <w:sz w:val="18"/>
+                <w:szCs w:val="18"/>
+              </w:rPr>
+              <w:t xml:space="preserve">Uriel Tapiwa Munjanga</w:t>
+            </w:r>
+          </w:p>
+        </w:tc>
+        <w:tc>
+          <w:tcPr>
+            <w:tcW w:type="dxa" w:w="2960"/>
+            <w:gridSpan w:val="1"/>
+            <w:tcBorders>
+              <w:top w:val="single" w:color="DDDDDD" w:sz="4"/>
+              <w:left w:val="single" w:color="DDDDDD" w:sz="4"/>
+              <w:bottom w:val="single" w:color="DDDDDD" w:sz="4"/>
+              <w:right w:val="single" w:color="DDDDDD" w:sz="4"/>
+            </w:tcBorders>
+            <w:shd w:fill="FFFFFF" w:val="clear"/>
+            <w:tcMar>
+              <w:top w:type="dxa" w:w="80"/>
+              <w:left w:type="dxa" w:w="120"/>
+              <w:bottom w:type="dxa" w:w="80"/>
+              <w:right w:type="dxa" w:w="120"/>
+            </w:tcMar>
+            <w:vAlign w:val="center"/>
+          </w:tcPr>
+          <w:p>
+            <w:pPr>
+              <w:jc w:val="left"/>
+            </w:pPr>
+            <w:r>
+              <w:rPr>
+                <w:rFonts w:ascii="Arial" w:cs="Arial" w:eastAsia="Arial" w:hAnsi="Arial"/>
+                <w:b w:val="false"/>
+                <w:bCs w:val="false"/>
+                <w:i w:val="false"/>
+                <w:iCs w:val="false"/>
+                <w:color w:val="1A1A1A"/>
+                <w:sz w:val="18"/>
+                <w:szCs w:val="18"/>
+              </w:rPr>
+              <w:t xml:space="preserve">Added Section 9 — Candidates API (Reference Implementation): documents the implemented POST/GET candidate endpoints, the gateway route, and RFC 9457 ProblemDetails error mapping.</w:t>
+            </w:r>
+          </w:p>
+        </w:tc>
+      </w:tr>
     </w:tbl>
     <w:p>
       <w:r>
@@ -13928,6 +14082,63 @@
     <w:p>
       <w:r>
         <w:t xml:space="preserve"/>
+      </w:r>
+    </w:p>
+    <w:p>
+      <w:pPr>
+        <w:pStyle w:val="Heading2"/>
+        <w:spacing w:after="80" w:before="200"/>
+      </w:pPr>
+      <w:r>
+        <w:rPr>
+          <w:rFonts w:ascii="Arial" w:cs="Arial" w:eastAsia="Arial" w:hAnsi="Arial"/>
+        </w:rPr>
+        <w:t xml:space="preserve">9. Candidates API — Reference Implementation</w:t>
+      </w:r>
+    </w:p>
+    <w:p>
+      <w:pPr>
+        <w:spacing w:after="120"/>
+        <w:jc w:val="both"/>
+      </w:pPr>
+      <w:r>
+        <w:rPr>
+          <w:rFonts w:ascii="Arial" w:cs="Arial" w:eastAsia="Arial" w:hAnsi="Arial"/>
+          <w:color w:val="1A1A1A"/>
+          <w:sz w:val="20"/>
+          <w:szCs w:val="20"/>
+        </w:rPr>
+        <w:t xml:space="preserve">The Candidates service is the reference implementation of these API standards. It exposes a versioned REST resource at /v1/candidates, reachable through the YARP gateway at /api/candidates (rewritten to /v1/candidates).</w:t>
+      </w:r>
+    </w:p>
+    <w:p>
+      <w:pPr>
+        <w:spacing w:after="120"/>
+        <w:jc w:val="both"/>
+      </w:pPr>
+      <w:r>
+        <w:rPr>
+          <w:rFonts w:ascii="Arial" w:cs="Arial" w:eastAsia="Arial" w:hAnsi="Arial"/>
+          <w:color w:val="1A1A1A"/>
+          <w:sz w:val="20"/>
+          <w:szCs w:val="20"/>
+        </w:rPr>
+        <w:t xml:space="preserve">Endpoints: POST /v1/candidates registers a candidate and returns 201 Created with a Location header; GET /v1/candidates/{id} returns the candidate, or 404 if unknown; GET /v1/candidates?city= returns a paged, case-insensitive filtered list. The OpenAPI 3.1 description is served at /openapi/v1.json.</w:t>
+      </w:r>
+    </w:p>
+    <w:p>
+      <w:pPr>
+        <w:spacing w:after="120"/>
+        <w:jc w:val="both"/>
+      </w:pPr>
+      <w:r>
+        <w:rPr>
+          <w:rFonts w:ascii="Arial" w:cs="Arial" w:eastAsia="Arial" w:hAnsi="Arial"/>
+          <w:color w:val="1A1A1A"/>
+          <w:sz w:val="20"/>
+          <w:szCs w:val="20"/>
+        </w:rPr>
+        <w:t xml:space="preserve">Errors follow RFC 9457 ProblemDetails (Section 5): validation failures return 400 with a stable dotted code (for example candidate.first_name_required) and a traceId; an unknown id returns 404 with candidate.not_found.</w:t>
       </w:r>
     </w:p>
     <w:p>

</xml_diff>